<commit_message>
feat: add team member names to dashboard
- Model 1 (Scorecard): Lis Indriani
- Model 2 (VaR Aktuaria): Ana Sulistiana Alwi
- Model 3 (VaR Integrasi & BIA): Andi Agung Dwi Arya B

Updated in both static/index.html and app.py (sidebar, headers, captions)

Co-authored-by: Copilot <223556219+Copilot@users.noreply.github.com>
</commit_message>
<xml_diff>
--- a/Laporan_ORM_DataMining.docx
+++ b/Laporan_ORM_DataMining.docx
@@ -125,7 +125,7 @@
         <w:pStyle w:val="Judul1"/>
         <w:spacing w:after="200"/>
       </w:pPr>
-      <w:bookmarkStart w:id="0" w:name="_Toc231395052"/>
+      <w:bookmarkStart w:name="_Toc231395052" w:id="0"/>
       <w:r>
         <w:lastRenderedPageBreak/>
         <w:t>Daftar Isi</w:t>
@@ -151,7 +151,7 @@
       <w:r>
         <w:fldChar w:fldCharType="separate"/>
       </w:r>
-      <w:hyperlink w:anchor="_Toc231395052" w:history="1">
+      <w:hyperlink w:history="1" w:anchor="_Toc231395052">
         <w:r>
           <w:rPr>
             <w:rStyle w:val="Hyperlink"/>
@@ -212,7 +212,7 @@
           <w:noProof/>
         </w:rPr>
       </w:pPr>
-      <w:hyperlink w:anchor="_Toc231395053" w:history="1">
+      <w:hyperlink w:history="1" w:anchor="_Toc231395053">
         <w:r>
           <w:rPr>
             <w:rStyle w:val="Hyperlink"/>
@@ -273,7 +273,7 @@
           <w:noProof/>
         </w:rPr>
       </w:pPr>
-      <w:hyperlink w:anchor="_Toc231395054" w:history="1">
+      <w:hyperlink w:history="1" w:anchor="_Toc231395054">
         <w:r>
           <w:rPr>
             <w:rStyle w:val="Hyperlink"/>
@@ -334,7 +334,7 @@
           <w:noProof/>
         </w:rPr>
       </w:pPr>
-      <w:hyperlink w:anchor="_Toc231395055" w:history="1">
+      <w:hyperlink w:history="1" w:anchor="_Toc231395055">
         <w:r>
           <w:rPr>
             <w:rStyle w:val="Hyperlink"/>
@@ -395,7 +395,7 @@
           <w:noProof/>
         </w:rPr>
       </w:pPr>
-      <w:hyperlink w:anchor="_Toc231395056" w:history="1">
+      <w:hyperlink w:history="1" w:anchor="_Toc231395056">
         <w:r>
           <w:rPr>
             <w:rStyle w:val="Hyperlink"/>
@@ -456,7 +456,7 @@
           <w:noProof/>
         </w:rPr>
       </w:pPr>
-      <w:hyperlink w:anchor="_Toc231395057" w:history="1">
+      <w:hyperlink w:history="1" w:anchor="_Toc231395057">
         <w:r>
           <w:rPr>
             <w:rStyle w:val="Hyperlink"/>
@@ -517,7 +517,7 @@
           <w:noProof/>
         </w:rPr>
       </w:pPr>
-      <w:hyperlink w:anchor="_Toc231395058" w:history="1">
+      <w:hyperlink w:history="1" w:anchor="_Toc231395058">
         <w:r>
           <w:rPr>
             <w:rStyle w:val="Hyperlink"/>
@@ -578,7 +578,7 @@
           <w:noProof/>
         </w:rPr>
       </w:pPr>
-      <w:hyperlink w:anchor="_Toc231395059" w:history="1">
+      <w:hyperlink w:history="1" w:anchor="_Toc231395059">
         <w:r>
           <w:rPr>
             <w:rStyle w:val="Hyperlink"/>
@@ -639,7 +639,7 @@
           <w:noProof/>
         </w:rPr>
       </w:pPr>
-      <w:hyperlink w:anchor="_Toc231395060" w:history="1">
+      <w:hyperlink w:history="1" w:anchor="_Toc231395060">
         <w:r>
           <w:rPr>
             <w:rStyle w:val="Hyperlink"/>
@@ -700,7 +700,7 @@
           <w:noProof/>
         </w:rPr>
       </w:pPr>
-      <w:hyperlink w:anchor="_Toc231395061" w:history="1">
+      <w:hyperlink w:history="1" w:anchor="_Toc231395061">
         <w:r>
           <w:rPr>
             <w:rStyle w:val="Hyperlink"/>
@@ -761,7 +761,7 @@
           <w:noProof/>
         </w:rPr>
       </w:pPr>
-      <w:hyperlink w:anchor="_Toc231395062" w:history="1">
+      <w:hyperlink w:history="1" w:anchor="_Toc231395062">
         <w:r>
           <w:rPr>
             <w:rStyle w:val="Hyperlink"/>
@@ -822,7 +822,7 @@
           <w:noProof/>
         </w:rPr>
       </w:pPr>
-      <w:hyperlink w:anchor="_Toc231395063" w:history="1">
+      <w:hyperlink w:history="1" w:anchor="_Toc231395063">
         <w:r>
           <w:rPr>
             <w:rStyle w:val="Hyperlink"/>
@@ -883,7 +883,7 @@
           <w:noProof/>
         </w:rPr>
       </w:pPr>
-      <w:hyperlink w:anchor="_Toc231395064" w:history="1">
+      <w:hyperlink w:history="1" w:anchor="_Toc231395064">
         <w:r>
           <w:rPr>
             <w:rStyle w:val="Hyperlink"/>
@@ -944,7 +944,7 @@
           <w:noProof/>
         </w:rPr>
       </w:pPr>
-      <w:hyperlink w:anchor="_Toc231395065" w:history="1">
+      <w:hyperlink w:history="1" w:anchor="_Toc231395065">
         <w:r>
           <w:rPr>
             <w:rStyle w:val="Hyperlink"/>
@@ -1005,7 +1005,7 @@
           <w:noProof/>
         </w:rPr>
       </w:pPr>
-      <w:hyperlink w:anchor="_Toc231395066" w:history="1">
+      <w:hyperlink w:history="1" w:anchor="_Toc231395066">
         <w:r>
           <w:rPr>
             <w:rStyle w:val="Hyperlink"/>
@@ -1066,7 +1066,7 @@
           <w:noProof/>
         </w:rPr>
       </w:pPr>
-      <w:hyperlink w:anchor="_Toc231395067" w:history="1">
+      <w:hyperlink w:history="1" w:anchor="_Toc231395067">
         <w:r>
           <w:rPr>
             <w:rStyle w:val="Hyperlink"/>
@@ -1127,7 +1127,7 @@
           <w:noProof/>
         </w:rPr>
       </w:pPr>
-      <w:hyperlink w:anchor="_Toc231395068" w:history="1">
+      <w:hyperlink w:history="1" w:anchor="_Toc231395068">
         <w:r>
           <w:rPr>
             <w:rStyle w:val="Hyperlink"/>
@@ -1188,7 +1188,7 @@
           <w:noProof/>
         </w:rPr>
       </w:pPr>
-      <w:hyperlink w:anchor="_Toc231395069" w:history="1">
+      <w:hyperlink w:history="1" w:anchor="_Toc231395069">
         <w:r>
           <w:rPr>
             <w:rStyle w:val="Hyperlink"/>
@@ -1249,7 +1249,7 @@
           <w:noProof/>
         </w:rPr>
       </w:pPr>
-      <w:hyperlink w:anchor="_Toc231395070" w:history="1">
+      <w:hyperlink w:history="1" w:anchor="_Toc231395070">
         <w:r>
           <w:rPr>
             <w:rStyle w:val="Hyperlink"/>
@@ -1310,7 +1310,7 @@
           <w:noProof/>
         </w:rPr>
       </w:pPr>
-      <w:hyperlink w:anchor="_Toc231395071" w:history="1">
+      <w:hyperlink w:history="1" w:anchor="_Toc231395071">
         <w:r>
           <w:rPr>
             <w:rStyle w:val="Hyperlink"/>
@@ -1371,7 +1371,7 @@
           <w:noProof/>
         </w:rPr>
       </w:pPr>
-      <w:hyperlink w:anchor="_Toc231395072" w:history="1">
+      <w:hyperlink w:history="1" w:anchor="_Toc231395072">
         <w:r>
           <w:rPr>
             <w:rStyle w:val="Hyperlink"/>
@@ -1432,7 +1432,7 @@
           <w:noProof/>
         </w:rPr>
       </w:pPr>
-      <w:hyperlink w:anchor="_Toc231395073" w:history="1">
+      <w:hyperlink w:history="1" w:anchor="_Toc231395073">
         <w:r>
           <w:rPr>
             <w:rStyle w:val="Hyperlink"/>
@@ -1497,7 +1497,7 @@
       <w:pPr>
         <w:pStyle w:val="Judul1"/>
       </w:pPr>
-      <w:bookmarkStart w:id="1" w:name="_Toc231395053"/>
+      <w:bookmarkStart w:name="_Toc231395053" w:id="1"/>
       <w:r>
         <w:lastRenderedPageBreak/>
         <w:t>BAB I  PENDAHULUAN</w:t>
@@ -1508,7 +1508,7 @@
       <w:pPr>
         <w:pStyle w:val="Judul2"/>
       </w:pPr>
-      <w:bookmarkStart w:id="2" w:name="_Toc231395054"/>
+      <w:bookmarkStart w:name="_Toc231395054" w:id="2"/>
       <w:r>
         <w:t>1.1  Latar Belakang</w:t>
       </w:r>
@@ -1536,7 +1536,7 @@
       <w:pPr>
         <w:pStyle w:val="Judul2"/>
       </w:pPr>
-      <w:bookmarkStart w:id="3" w:name="_Toc231395055"/>
+      <w:bookmarkStart w:name="_Toc231395055" w:id="3"/>
       <w:r>
         <w:t>1.2  Rumusan Masalah</w:t>
       </w:r>
@@ -1555,7 +1555,7 @@
       <w:pPr>
         <w:pStyle w:val="Judul2"/>
       </w:pPr>
-      <w:bookmarkStart w:id="4" w:name="_Toc231395056"/>
+      <w:bookmarkStart w:name="_Toc231395056" w:id="4"/>
       <w:r>
         <w:t>1.3  Tujuan</w:t>
       </w:r>
@@ -1574,7 +1574,7 @@
       <w:pPr>
         <w:pStyle w:val="Judul2"/>
       </w:pPr>
-      <w:bookmarkStart w:id="5" w:name="_Toc231395057"/>
+      <w:bookmarkStart w:name="_Toc231395057" w:id="5"/>
       <w:r>
         <w:t>1.4  Manfaat</w:t>
       </w:r>
@@ -1593,7 +1593,7 @@
       <w:pPr>
         <w:pStyle w:val="Judul1"/>
       </w:pPr>
-      <w:bookmarkStart w:id="6" w:name="_Toc231395058"/>
+      <w:bookmarkStart w:name="_Toc231395058" w:id="6"/>
       <w:r>
         <w:t>BAB II  DATASET DAN METODOLOGI</w:t>
       </w:r>
@@ -1603,7 +1603,7 @@
       <w:pPr>
         <w:pStyle w:val="Judul2"/>
       </w:pPr>
-      <w:bookmarkStart w:id="7" w:name="_Toc231395059"/>
+      <w:bookmarkStart w:name="_Toc231395059" w:id="7"/>
       <w:r>
         <w:t>2.1  Deskripsi Dataset</w:t>
       </w:r>
@@ -1639,12 +1639,12 @@
       <w:tblPr>
         <w:tblW w:w="8306" w:type="dxa"/>
         <w:tblBorders>
-          <w:top w:val="single" w:sz="4" w:space="0" w:color="auto"/>
-          <w:left w:val="single" w:sz="4" w:space="0" w:color="auto"/>
-          <w:bottom w:val="single" w:sz="4" w:space="0" w:color="auto"/>
-          <w:right w:val="single" w:sz="4" w:space="0" w:color="auto"/>
-          <w:insideH w:val="single" w:sz="4" w:space="0" w:color="auto"/>
-          <w:insideV w:val="single" w:sz="4" w:space="0" w:color="auto"/>
+          <w:top w:val="single" w:color="auto" w:sz="4" w:space="0"/>
+          <w:left w:val="single" w:color="auto" w:sz="4" w:space="0"/>
+          <w:bottom w:val="single" w:color="auto" w:sz="4" w:space="0"/>
+          <w:right w:val="single" w:color="auto" w:sz="4" w:space="0"/>
+          <w:insideH w:val="single" w:color="auto" w:sz="4" w:space="0"/>
+          <w:insideV w:val="single" w:color="auto" w:sz="4" w:space="0"/>
         </w:tblBorders>
         <w:tblCellMar>
           <w:left w:w="10" w:type="dxa"/>
@@ -2193,7 +2193,7 @@
       <w:pPr>
         <w:pStyle w:val="Judul2"/>
       </w:pPr>
-      <w:bookmarkStart w:id="8" w:name="_Toc231395060"/>
+      <w:bookmarkStart w:name="_Toc231395060" w:id="8"/>
       <w:r>
         <w:t>2.2  Metodologi</w:t>
       </w:r>
@@ -2212,7 +2212,7 @@
       <w:pPr>
         <w:pStyle w:val="Judul2"/>
       </w:pPr>
-      <w:bookmarkStart w:id="9" w:name="_Toc231395061"/>
+      <w:bookmarkStart w:name="_Toc231395061" w:id="9"/>
       <w:r>
         <w:t>2.3  Pra-pemrosesan dan Rekayasa Fitur</w:t>
       </w:r>
@@ -2234,7 +2234,7 @@
       <w:pPr>
         <w:pStyle w:val="Judul2"/>
       </w:pPr>
-      <w:bookmarkStart w:id="10" w:name="_Toc231395062"/>
+      <w:bookmarkStart w:name="_Toc231395062" w:id="10"/>
       <w:r>
         <w:t>2.4  Pembagian Tugas Kelompok</w:t>
       </w:r>
@@ -2266,12 +2266,12 @@
       <w:tblPr>
         <w:tblW w:w="8304" w:type="dxa"/>
         <w:tblBorders>
-          <w:top w:val="single" w:sz="4" w:space="0" w:color="auto"/>
-          <w:left w:val="single" w:sz="4" w:space="0" w:color="auto"/>
-          <w:bottom w:val="single" w:sz="4" w:space="0" w:color="auto"/>
-          <w:right w:val="single" w:sz="4" w:space="0" w:color="auto"/>
-          <w:insideH w:val="single" w:sz="4" w:space="0" w:color="auto"/>
-          <w:insideV w:val="single" w:sz="4" w:space="0" w:color="auto"/>
+          <w:top w:val="single" w:color="auto" w:sz="4" w:space="0"/>
+          <w:left w:val="single" w:color="auto" w:sz="4" w:space="0"/>
+          <w:bottom w:val="single" w:color="auto" w:sz="4" w:space="0"/>
+          <w:right w:val="single" w:color="auto" w:sz="4" w:space="0"/>
+          <w:insideH w:val="single" w:color="auto" w:sz="4" w:space="0"/>
+          <w:insideV w:val="single" w:color="auto" w:sz="4" w:space="0"/>
         </w:tblBorders>
         <w:tblCellMar>
           <w:left w:w="10" w:type="dxa"/>
@@ -2543,7 +2543,7 @@
       <w:pPr>
         <w:pStyle w:val="Judul2"/>
       </w:pPr>
-      <w:bookmarkStart w:id="11" w:name="_Toc231395063"/>
+      <w:bookmarkStart w:name="_Toc231395063" w:id="11"/>
       <w:r>
         <w:lastRenderedPageBreak/>
         <w:t>2.5  Model dan Metrik Evaluasi</w:t>
@@ -2563,7 +2563,7 @@
       <w:pPr>
         <w:pStyle w:val="Judul1"/>
       </w:pPr>
-      <w:bookmarkStart w:id="12" w:name="_Toc231395064"/>
+      <w:bookmarkStart w:name="_Toc231395064" w:id="12"/>
       <w:r>
         <w:t>BAB III  HASIL DAN PEMBAHASAN</w:t>
       </w:r>
@@ -2573,7 +2573,7 @@
       <w:pPr>
         <w:pStyle w:val="Judul2"/>
       </w:pPr>
-      <w:bookmarkStart w:id="13" w:name="_Toc231395065"/>
+      <w:bookmarkStart w:name="_Toc231395065" w:id="13"/>
       <w:r>
         <w:t>3.1  Analisis Data Eksploratif (EDA)</w:t>
       </w:r>
@@ -2592,7 +2592,7 @@
       <w:pPr>
         <w:pStyle w:val="Judul2"/>
       </w:pPr>
-      <w:bookmarkStart w:id="14" w:name="_Toc231395066"/>
+      <w:bookmarkStart w:name="_Toc231395066" w:id="14"/>
       <w:r>
         <w:t>3.2  Hasil Klasifikasi</w:t>
       </w:r>
@@ -2624,12 +2624,12 @@
       <w:tblPr>
         <w:tblW w:w="8304" w:type="dxa"/>
         <w:tblBorders>
-          <w:top w:val="single" w:sz="4" w:space="0" w:color="auto"/>
-          <w:left w:val="single" w:sz="4" w:space="0" w:color="auto"/>
-          <w:bottom w:val="single" w:sz="4" w:space="0" w:color="auto"/>
-          <w:right w:val="single" w:sz="4" w:space="0" w:color="auto"/>
-          <w:insideH w:val="single" w:sz="4" w:space="0" w:color="auto"/>
-          <w:insideV w:val="single" w:sz="4" w:space="0" w:color="auto"/>
+          <w:top w:val="single" w:color="auto" w:sz="4" w:space="0"/>
+          <w:left w:val="single" w:color="auto" w:sz="4" w:space="0"/>
+          <w:bottom w:val="single" w:color="auto" w:sz="4" w:space="0"/>
+          <w:right w:val="single" w:color="auto" w:sz="4" w:space="0"/>
+          <w:insideH w:val="single" w:color="auto" w:sz="4" w:space="0"/>
+          <w:insideV w:val="single" w:color="auto" w:sz="4" w:space="0"/>
         </w:tblBorders>
         <w:tblCellMar>
           <w:left w:w="10" w:type="dxa"/>
@@ -3254,7 +3254,7 @@
       <w:pPr>
         <w:pStyle w:val="Judul2"/>
       </w:pPr>
-      <w:bookmarkStart w:id="15" w:name="_Toc231395067"/>
+      <w:bookmarkStart w:name="_Toc231395067" w:id="15"/>
       <w:r>
         <w:t>3.3  Hasil Deteksi Anomali</w:t>
       </w:r>
@@ -3273,7 +3273,7 @@
       <w:pPr>
         <w:pStyle w:val="Judul2"/>
       </w:pPr>
-      <w:bookmarkStart w:id="16" w:name="_Toc231395068"/>
+      <w:bookmarkStart w:name="_Toc231395068" w:id="16"/>
       <w:r>
         <w:t>3.4  Hasil Klastering (Segmentasi Profil Risiko)</w:t>
       </w:r>
@@ -3309,12 +3309,12 @@
       <w:tblPr>
         <w:tblW w:w="8304" w:type="dxa"/>
         <w:tblBorders>
-          <w:top w:val="single" w:sz="4" w:space="0" w:color="auto"/>
-          <w:left w:val="single" w:sz="4" w:space="0" w:color="auto"/>
-          <w:bottom w:val="single" w:sz="4" w:space="0" w:color="auto"/>
-          <w:right w:val="single" w:sz="4" w:space="0" w:color="auto"/>
-          <w:insideH w:val="single" w:sz="4" w:space="0" w:color="auto"/>
-          <w:insideV w:val="single" w:sz="4" w:space="0" w:color="auto"/>
+          <w:top w:val="single" w:color="auto" w:sz="4" w:space="0"/>
+          <w:left w:val="single" w:color="auto" w:sz="4" w:space="0"/>
+          <w:bottom w:val="single" w:color="auto" w:sz="4" w:space="0"/>
+          <w:right w:val="single" w:color="auto" w:sz="4" w:space="0"/>
+          <w:insideH w:val="single" w:color="auto" w:sz="4" w:space="0"/>
+          <w:insideV w:val="single" w:color="auto" w:sz="4" w:space="0"/>
         </w:tblBorders>
         <w:tblCellMar>
           <w:left w:w="10" w:type="dxa"/>
@@ -3663,7 +3663,7 @@
       <w:pPr>
         <w:pStyle w:val="Judul1"/>
       </w:pPr>
-      <w:bookmarkStart w:id="17" w:name="_Toc231395069"/>
+      <w:bookmarkStart w:name="_Toc231395069" w:id="17"/>
       <w:r>
         <w:t>BAB IV  KESIMPULAN DAN REKOMENDASI</w:t>
       </w:r>
@@ -3673,7 +3673,7 @@
       <w:pPr>
         <w:pStyle w:val="Judul2"/>
       </w:pPr>
-      <w:bookmarkStart w:id="18" w:name="_Toc231395070"/>
+      <w:bookmarkStart w:name="_Toc231395070" w:id="18"/>
       <w:r>
         <w:t>4.1  Kesimpulan</w:t>
       </w:r>
@@ -3695,7 +3695,7 @@
       <w:pPr>
         <w:pStyle w:val="Judul2"/>
       </w:pPr>
-      <w:bookmarkStart w:id="19" w:name="_Toc231395071"/>
+      <w:bookmarkStart w:name="_Toc231395071" w:id="19"/>
       <w:r>
         <w:t>4.2  Rekomendasi Mitigasi Risiko Operasional</w:t>
       </w:r>
@@ -3741,7 +3741,7 @@
       <w:pPr>
         <w:pStyle w:val="Judul2"/>
       </w:pPr>
-      <w:bookmarkStart w:id="20" w:name="_Toc231395072"/>
+      <w:bookmarkStart w:name="_Toc231395072" w:id="20"/>
       <w:r>
         <w:t>4.3  Keterbatasan dan Pengembangan Lanjutan</w:t>
       </w:r>
@@ -3760,7 +3760,7 @@
       <w:pPr>
         <w:pStyle w:val="Judul1"/>
       </w:pPr>
-      <w:bookmarkStart w:id="21" w:name="_Toc231395073"/>
+      <w:bookmarkStart w:name="_Toc231395073" w:id="21"/>
       <w:r>
         <w:t>DAFTAR PUSTAKA</w:t>
       </w:r>
@@ -3914,7 +3914,7 @@
   <w:docDefaults>
     <w:rPrDefault>
       <w:rPr>
-        <w:rFonts w:ascii="Calibri" w:eastAsia="Calibri" w:hAnsi="Calibri" w:cs="Calibri"/>
+        <w:rFonts w:ascii="Calibri" w:hAnsi="Calibri" w:eastAsia="Calibri" w:cs="Calibri"/>
         <w:sz w:val="22"/>
         <w:szCs w:val="22"/>
         <w:lang w:val="en-US" w:eastAsia="en-US" w:bidi="ar-SA"/>
@@ -3925,14 +3925,14 @@
   <w:latentStyles w:defLockedState="0" w:defUIPriority="99" w:defSemiHidden="0" w:defUnhideWhenUsed="0" w:defQFormat="0" w:count="376">
     <w:lsdException w:name="Normal" w:uiPriority="0" w:qFormat="1"/>
     <w:lsdException w:name="heading 1" w:uiPriority="9" w:qFormat="1"/>
-    <w:lsdException w:name="heading 2" w:semiHidden="1" w:uiPriority="9" w:unhideWhenUsed="1" w:qFormat="1"/>
-    <w:lsdException w:name="heading 3" w:semiHidden="1" w:uiPriority="9" w:unhideWhenUsed="1" w:qFormat="1"/>
-    <w:lsdException w:name="heading 4" w:semiHidden="1" w:uiPriority="9" w:unhideWhenUsed="1" w:qFormat="1"/>
-    <w:lsdException w:name="heading 5" w:semiHidden="1" w:uiPriority="9" w:unhideWhenUsed="1" w:qFormat="1"/>
-    <w:lsdException w:name="heading 6" w:semiHidden="1" w:uiPriority="9" w:unhideWhenUsed="1" w:qFormat="1"/>
-    <w:lsdException w:name="heading 7" w:semiHidden="1" w:uiPriority="9" w:unhideWhenUsed="1" w:qFormat="1"/>
-    <w:lsdException w:name="heading 8" w:semiHidden="1" w:uiPriority="9" w:unhideWhenUsed="1" w:qFormat="1"/>
-    <w:lsdException w:name="heading 9" w:semiHidden="1" w:uiPriority="9" w:unhideWhenUsed="1" w:qFormat="1"/>
+    <w:lsdException w:name="heading 2" w:uiPriority="9" w:semiHidden="1" w:unhideWhenUsed="1" w:qFormat="1"/>
+    <w:lsdException w:name="heading 3" w:uiPriority="9" w:semiHidden="1" w:unhideWhenUsed="1" w:qFormat="1"/>
+    <w:lsdException w:name="heading 4" w:uiPriority="9" w:semiHidden="1" w:unhideWhenUsed="1" w:qFormat="1"/>
+    <w:lsdException w:name="heading 5" w:uiPriority="9" w:semiHidden="1" w:unhideWhenUsed="1" w:qFormat="1"/>
+    <w:lsdException w:name="heading 6" w:uiPriority="9" w:semiHidden="1" w:unhideWhenUsed="1" w:qFormat="1"/>
+    <w:lsdException w:name="heading 7" w:uiPriority="9" w:semiHidden="1" w:unhideWhenUsed="1" w:qFormat="1"/>
+    <w:lsdException w:name="heading 8" w:uiPriority="9" w:semiHidden="1" w:unhideWhenUsed="1" w:qFormat="1"/>
+    <w:lsdException w:name="heading 9" w:uiPriority="9" w:semiHidden="1" w:unhideWhenUsed="1" w:qFormat="1"/>
     <w:lsdException w:name="index 1" w:semiHidden="1" w:unhideWhenUsed="1"/>
     <w:lsdException w:name="index 2" w:semiHidden="1" w:unhideWhenUsed="1"/>
     <w:lsdException w:name="index 3" w:semiHidden="1" w:unhideWhenUsed="1"/>
@@ -3942,22 +3942,22 @@
     <w:lsdException w:name="index 7" w:semiHidden="1" w:unhideWhenUsed="1"/>
     <w:lsdException w:name="index 8" w:semiHidden="1" w:unhideWhenUsed="1"/>
     <w:lsdException w:name="index 9" w:semiHidden="1" w:unhideWhenUsed="1"/>
-    <w:lsdException w:name="toc 1" w:semiHidden="1" w:uiPriority="39" w:unhideWhenUsed="1"/>
-    <w:lsdException w:name="toc 2" w:semiHidden="1" w:uiPriority="39" w:unhideWhenUsed="1"/>
-    <w:lsdException w:name="toc 3" w:semiHidden="1" w:uiPriority="39" w:unhideWhenUsed="1"/>
-    <w:lsdException w:name="toc 4" w:semiHidden="1" w:uiPriority="39" w:unhideWhenUsed="1"/>
-    <w:lsdException w:name="toc 5" w:semiHidden="1" w:uiPriority="39" w:unhideWhenUsed="1"/>
-    <w:lsdException w:name="toc 6" w:semiHidden="1" w:uiPriority="39" w:unhideWhenUsed="1"/>
-    <w:lsdException w:name="toc 7" w:semiHidden="1" w:uiPriority="39" w:unhideWhenUsed="1"/>
-    <w:lsdException w:name="toc 8" w:semiHidden="1" w:uiPriority="39" w:unhideWhenUsed="1"/>
-    <w:lsdException w:name="toc 9" w:semiHidden="1" w:uiPriority="39" w:unhideWhenUsed="1"/>
+    <w:lsdException w:name="toc 1" w:uiPriority="39" w:semiHidden="1" w:unhideWhenUsed="1"/>
+    <w:lsdException w:name="toc 2" w:uiPriority="39" w:semiHidden="1" w:unhideWhenUsed="1"/>
+    <w:lsdException w:name="toc 3" w:uiPriority="39" w:semiHidden="1" w:unhideWhenUsed="1"/>
+    <w:lsdException w:name="toc 4" w:uiPriority="39" w:semiHidden="1" w:unhideWhenUsed="1"/>
+    <w:lsdException w:name="toc 5" w:uiPriority="39" w:semiHidden="1" w:unhideWhenUsed="1"/>
+    <w:lsdException w:name="toc 6" w:uiPriority="39" w:semiHidden="1" w:unhideWhenUsed="1"/>
+    <w:lsdException w:name="toc 7" w:uiPriority="39" w:semiHidden="1" w:unhideWhenUsed="1"/>
+    <w:lsdException w:name="toc 8" w:uiPriority="39" w:semiHidden="1" w:unhideWhenUsed="1"/>
+    <w:lsdException w:name="toc 9" w:uiPriority="39" w:semiHidden="1" w:unhideWhenUsed="1"/>
     <w:lsdException w:name="Normal Indent" w:semiHidden="1" w:unhideWhenUsed="1"/>
     <w:lsdException w:name="footnote text" w:semiHidden="1" w:unhideWhenUsed="1"/>
     <w:lsdException w:name="annotation text" w:semiHidden="1" w:unhideWhenUsed="1"/>
     <w:lsdException w:name="header" w:semiHidden="1" w:unhideWhenUsed="1"/>
     <w:lsdException w:name="footer" w:semiHidden="1" w:unhideWhenUsed="1"/>
     <w:lsdException w:name="index heading" w:semiHidden="1" w:unhideWhenUsed="1"/>
-    <w:lsdException w:name="caption" w:semiHidden="1" w:uiPriority="35" w:unhideWhenUsed="1" w:qFormat="1"/>
+    <w:lsdException w:name="caption" w:uiPriority="35" w:semiHidden="1" w:unhideWhenUsed="1" w:qFormat="1"/>
     <w:lsdException w:name="table of figures" w:semiHidden="1" w:unhideWhenUsed="1"/>
     <w:lsdException w:name="envelope address" w:semiHidden="1" w:unhideWhenUsed="1"/>
     <w:lsdException w:name="envelope return" w:semiHidden="1" w:unhideWhenUsed="1"/>
@@ -3988,7 +3988,7 @@
     <w:lsdException w:name="Title" w:uiPriority="10" w:qFormat="1"/>
     <w:lsdException w:name="Closing" w:semiHidden="1" w:unhideWhenUsed="1"/>
     <w:lsdException w:name="Signature" w:semiHidden="1" w:unhideWhenUsed="1"/>
-    <w:lsdException w:name="Default Paragraph Font" w:semiHidden="1" w:uiPriority="1" w:unhideWhenUsed="1"/>
+    <w:lsdException w:name="Default Paragraph Font" w:uiPriority="1" w:semiHidden="1" w:unhideWhenUsed="1"/>
     <w:lsdException w:name="Body Text" w:semiHidden="1" w:unhideWhenUsed="1"/>
     <w:lsdException w:name="Body Text Indent" w:semiHidden="1" w:unhideWhenUsed="1"/>
     <w:lsdException w:name="List Continue" w:semiHidden="1" w:unhideWhenUsed="1"/>
@@ -4188,8 +4188,8 @@
     <w:lsdException w:name="Subtle Reference" w:uiPriority="31" w:qFormat="1"/>
     <w:lsdException w:name="Intense Reference" w:uiPriority="32" w:qFormat="1"/>
     <w:lsdException w:name="Book Title" w:uiPriority="33" w:qFormat="1"/>
-    <w:lsdException w:name="Bibliography" w:semiHidden="1" w:uiPriority="37" w:unhideWhenUsed="1"/>
-    <w:lsdException w:name="TOC Heading" w:semiHidden="1" w:uiPriority="39" w:unhideWhenUsed="1" w:qFormat="1"/>
+    <w:lsdException w:name="Bibliography" w:uiPriority="37" w:semiHidden="1" w:unhideWhenUsed="1"/>
+    <w:lsdException w:name="TOC Heading" w:uiPriority="39" w:semiHidden="1" w:unhideWhenUsed="1" w:qFormat="1"/>
     <w:lsdException w:name="Plain Table 1" w:uiPriority="41"/>
     <w:lsdException w:name="Plain Table 2" w:uiPriority="42"/>
     <w:lsdException w:name="Plain Table 3" w:uiPriority="43"/>
@@ -4300,7 +4300,7 @@
     <w:lsdException w:name="Unresolved Mention" w:semiHidden="1" w:unhideWhenUsed="1"/>
     <w:lsdException w:name="Smart Link" w:semiHidden="1" w:unhideWhenUsed="1"/>
   </w:latentStyles>
-  <w:style w:type="paragraph" w:default="1" w:styleId="Normal">
+  <w:style w:type="paragraph" w:styleId="Normal" w:default="1">
     <w:name w:val="Normal"/>
     <w:qFormat/>
     <w:pPr>
@@ -4358,13 +4358,13 @@
       <w:sz w:val="24"/>
     </w:rPr>
   </w:style>
-  <w:style w:type="character" w:default="1" w:styleId="FontParagrafDefault">
+  <w:style w:type="character" w:styleId="FontParagrafDefault" w:default="1">
     <w:name w:val="Default Paragraph Font"/>
     <w:uiPriority w:val="1"/>
     <w:semiHidden/>
     <w:unhideWhenUsed/>
   </w:style>
-  <w:style w:type="table" w:default="1" w:styleId="TabelNormal">
+  <w:style w:type="table" w:styleId="TabelNormal" w:default="1">
     <w:name w:val="Normal Table"/>
     <w:uiPriority w:val="99"/>
     <w:semiHidden/>
@@ -4379,7 +4379,7 @@
       </w:tblCellMar>
     </w:tblPr>
   </w:style>
-  <w:style w:type="numbering" w:default="1" w:styleId="TidakAdaDaftar">
+  <w:style w:type="numbering" w:styleId="TidakAdaDaftar" w:default="1">
     <w:name w:val="No List"/>
     <w:uiPriority w:val="99"/>
     <w:semiHidden/>

</xml_diff>